<commit_message>
docs(slides): separate 5-minute deck matched to the short script
- slides/build_slides_short.py builds Slides_Nhom6_RutGon_5Phut.pptx with
  the full deck's design: 9 main slides (cover, topic, what we did, RQ1,
  RQ2, RQ3, audit, conclusion, Q&A routing) and 7 backup slides P1-P7
  (demo, dataset, architecture, rules, setup, ablation, latency) that
  members open while answering questions
- slides/short_talk_content.py is the single source for the speech; it
  feeds the deck's speaker notes and the Word script
- build_short_script.py now follows the new deck one section per slide,
  checks the deck exists, and lists who answers which area with which
  backup slide; tables have pinned widths
- to_pdf.sh takes the deck name and addresses the presentation by name

Co-Authored-By: Claude Opus 5.5 <noreply@anthropic.com>
</commit_message>
<xml_diff>
--- a/slides/KichBan_RutGon_5Phut_Nhom6.docx
+++ b/slides/KichBan_RutGon_5Phut_Nhom6.docx
@@ -43,26 +43,27 @@
           <w:color w:val="808080"/>
           <w:sz w:val="22"/>
         </w:rPr>
-        <w:t>Lời nói khoảng 4:05 ở tốc độ 160 tiếng mỗi phút; cộng thời gian chuyển slide và ngắt nghỉ là khoảng 5 phút. Dùng cùng bộ slide với bản đầy đủ. Chữ xám là chỉ dẫn, không đọc thành tiếng. Bỏ qua khi trình bày bản rút gọn: slide 7 demo, slide 12 phân tích luật, hai slide phụ lục.</w:t>
+        <w:t>Bộ slide: slides/Slides_Nhom6_RutGon_5Phut.pptx, 9 slide trình bày và 7 slide dự phòng. Lời nói khoảng 4:05 ở tốc độ 160 tiếng mỗi phút; cộng chuyển slide và ngắt nghỉ là khoảng 5 phút. Thời gian còn lại dành cho câu hỏi; mỗi thành viên mở slide dự phòng của mảng mình khi trả lời. Lời nói của từng slide cũng nằm trong phần Notes của file .pptx.</w:t>
       </w:r>
     </w:p>
     <w:tbl>
       <w:tblPr>
         <w:tblStyle w:val="TableGrid"/>
-        <w:tblW w:type="auto" w:w="0"/>
+        <w:tblW w:type="dxa" w:w="9412"/>
         <w:jc w:val="center"/>
+        <w:tblLayout w:type="fixed"/>
         <w:tblLook w:firstColumn="1" w:firstRow="1" w:lastColumn="0" w:lastRow="0" w:noHBand="0" w:noVBand="1" w:val="04A0"/>
       </w:tblPr>
       <w:tblGrid>
-        <w:gridCol w:w="2353"/>
-        <w:gridCol w:w="2353"/>
-        <w:gridCol w:w="2353"/>
-        <w:gridCol w:w="2353"/>
+        <w:gridCol w:w="737"/>
+        <w:gridCol w:w="5953"/>
+        <w:gridCol w:w="1360"/>
+        <w:gridCol w:w="1360"/>
       </w:tblGrid>
       <w:tr>
         <w:tc>
           <w:tcPr>
-            <w:tcW w:type="dxa" w:w="2381"/>
+            <w:tcW w:type="dxa" w:w="737"/>
             <w:shd w:val="clear" w:color="auto" w:fill="1E6FE8"/>
           </w:tcPr>
           <w:p>
@@ -79,13 +80,13 @@
                 <w:color w:val="FFFFFF"/>
                 <w:sz w:val="22"/>
               </w:rPr>
-              <w:t>Phần</w:t>
+              <w:t>Slide</w:t>
             </w:r>
           </w:p>
         </w:tc>
         <w:tc>
           <w:tcPr>
-            <w:tcW w:type="dxa" w:w="3628"/>
+            <w:tcW w:type="dxa" w:w="5953"/>
             <w:shd w:val="clear" w:color="auto" w:fill="1E6FE8"/>
           </w:tcPr>
           <w:p>
@@ -102,13 +103,13 @@
                 <w:color w:val="FFFFFF"/>
                 <w:sz w:val="22"/>
               </w:rPr>
-              <w:t>Slide mở</w:t>
+              <w:t>Tiêu đề</w:t>
             </w:r>
           </w:p>
         </w:tc>
         <w:tc>
           <w:tcPr>
-            <w:tcW w:type="dxa" w:w="1701"/>
+            <w:tcW w:type="dxa" w:w="1361"/>
             <w:shd w:val="clear" w:color="auto" w:fill="1E6FE8"/>
           </w:tcPr>
           <w:p>
@@ -131,7 +132,7 @@
         </w:tc>
         <w:tc>
           <w:tcPr>
-            <w:tcW w:type="dxa" w:w="1701"/>
+            <w:tcW w:type="dxa" w:w="1361"/>
             <w:shd w:val="clear" w:color="auto" w:fill="1E6FE8"/>
           </w:tcPr>
           <w:p>
@@ -156,7 +157,7 @@
       <w:tr>
         <w:tc>
           <w:tcPr>
-            <w:tcW w:type="dxa" w:w="2381"/>
+            <w:tcW w:type="dxa" w:w="737"/>
           </w:tcPr>
           <w:p>
             <w:pPr>
@@ -171,13 +172,13 @@
                 <w:i w:val="0"/>
                 <w:sz w:val="22"/>
               </w:rPr>
-              <w:t>Mở đầu</w:t>
+              <w:t>1</w:t>
             </w:r>
           </w:p>
         </w:tc>
         <w:tc>
           <w:tcPr>
-            <w:tcW w:type="dxa" w:w="3628"/>
+            <w:tcW w:type="dxa" w:w="5953"/>
           </w:tcPr>
           <w:p>
             <w:pPr>
@@ -192,13 +193,13 @@
                 <w:i w:val="0"/>
                 <w:sz w:val="22"/>
               </w:rPr>
-              <w:t>Slide 1</w:t>
+              <w:t>Verifier-Guided Repair</w:t>
             </w:r>
           </w:p>
         </w:tc>
         <w:tc>
           <w:tcPr>
-            <w:tcW w:type="dxa" w:w="1701"/>
+            <w:tcW w:type="dxa" w:w="1361"/>
           </w:tcPr>
           <w:p>
             <w:pPr>
@@ -219,7 +220,7 @@
         </w:tc>
         <w:tc>
           <w:tcPr>
-            <w:tcW w:type="dxa" w:w="1701"/>
+            <w:tcW w:type="dxa" w:w="1361"/>
           </w:tcPr>
           <w:p>
             <w:pPr>
@@ -242,7 +243,7 @@
       <w:tr>
         <w:tc>
           <w:tcPr>
-            <w:tcW w:type="dxa" w:w="2381"/>
+            <w:tcW w:type="dxa" w:w="737"/>
           </w:tcPr>
           <w:p>
             <w:pPr>
@@ -257,13 +258,13 @@
                 <w:i w:val="0"/>
                 <w:sz w:val="22"/>
               </w:rPr>
-              <w:t>Đề tài là gì</w:t>
+              <w:t>2</w:t>
             </w:r>
           </w:p>
         </w:tc>
         <w:tc>
           <w:tcPr>
-            <w:tcW w:type="dxa" w:w="3628"/>
+            <w:tcW w:type="dxa" w:w="5953"/>
           </w:tcPr>
           <w:p>
             <w:pPr>
@@ -278,13 +279,13 @@
                 <w:i w:val="0"/>
                 <w:sz w:val="22"/>
               </w:rPr>
-              <w:t>Slide 2, rồi slide 4</w:t>
+              <w:t>Đề tài: tự động sửa chứng minh Lean bị lỗi, chỉ nhận bản sửa đã kiểm chứng</w:t>
             </w:r>
           </w:p>
         </w:tc>
         <w:tc>
           <w:tcPr>
-            <w:tcW w:type="dxa" w:w="1701"/>
+            <w:tcW w:type="dxa" w:w="1361"/>
           </w:tcPr>
           <w:p>
             <w:pPr>
@@ -305,7 +306,7 @@
         </w:tc>
         <w:tc>
           <w:tcPr>
-            <w:tcW w:type="dxa" w:w="1701"/>
+            <w:tcW w:type="dxa" w:w="1361"/>
           </w:tcPr>
           <w:p>
             <w:pPr>
@@ -328,7 +329,7 @@
       <w:tr>
         <w:tc>
           <w:tcPr>
-            <w:tcW w:type="dxa" w:w="2381"/>
+            <w:tcW w:type="dxa" w:w="737"/>
           </w:tcPr>
           <w:p>
             <w:pPr>
@@ -343,13 +344,13 @@
                 <w:i w:val="0"/>
                 <w:sz w:val="22"/>
               </w:rPr>
-              <w:t>Nhóm đã làm gì</w:t>
+              <w:t>3</w:t>
             </w:r>
           </w:p>
         </w:tc>
         <w:tc>
           <w:tcPr>
-            <w:tcW w:type="dxa" w:w="3628"/>
+            <w:tcW w:type="dxa" w:w="5953"/>
           </w:tcPr>
           <w:p>
             <w:pPr>
@@ -364,13 +365,13 @@
                 <w:i w:val="0"/>
                 <w:sz w:val="22"/>
               </w:rPr>
-              <w:t>Slide 3, 5, 6, rồi slide 8</w:t>
+              <w:t>Nhóm đã làm gì: dữ liệu, vòng sửa có kiểm toán, kiểm chứng nhanh, kiểm soát chi phí</w:t>
             </w:r>
           </w:p>
         </w:tc>
         <w:tc>
           <w:tcPr>
-            <w:tcW w:type="dxa" w:w="1701"/>
+            <w:tcW w:type="dxa" w:w="1361"/>
           </w:tcPr>
           <w:p>
             <w:pPr>
@@ -391,7 +392,7 @@
         </w:tc>
         <w:tc>
           <w:tcPr>
-            <w:tcW w:type="dxa" w:w="1701"/>
+            <w:tcW w:type="dxa" w:w="1361"/>
           </w:tcPr>
           <w:p>
             <w:pPr>
@@ -414,7 +415,7 @@
       <w:tr>
         <w:tc>
           <w:tcPr>
-            <w:tcW w:type="dxa" w:w="2381"/>
+            <w:tcW w:type="dxa" w:w="737"/>
           </w:tcPr>
           <w:p>
             <w:pPr>
@@ -429,13 +430,13 @@
                 <w:i w:val="0"/>
                 <w:sz w:val="22"/>
               </w:rPr>
-              <w:t>Kết quả</w:t>
+              <w:t>4</w:t>
             </w:r>
           </w:p>
         </w:tc>
         <w:tc>
           <w:tcPr>
-            <w:tcW w:type="dxa" w:w="3628"/>
+            <w:tcW w:type="dxa" w:w="5953"/>
           </w:tcPr>
           <w:p>
             <w:pPr>
@@ -450,13 +451,13 @@
                 <w:i w:val="0"/>
                 <w:sz w:val="22"/>
               </w:rPr>
-              <w:t>Slide 9, 10, 11, 13</w:t>
+              <w:t>RQ1: thông báo lỗi tăng 22 điểm % và còn rẻ hơn 45%</w:t>
             </w:r>
           </w:p>
         </w:tc>
         <w:tc>
           <w:tcPr>
-            <w:tcW w:type="dxa" w:w="1701"/>
+            <w:tcW w:type="dxa" w:w="1361"/>
           </w:tcPr>
           <w:p>
             <w:pPr>
@@ -471,13 +472,13 @@
                 <w:i w:val="0"/>
                 <w:sz w:val="22"/>
               </w:rPr>
-              <w:t>1:35</w:t>
+              <w:t>0:20</w:t>
             </w:r>
           </w:p>
         </w:tc>
         <w:tc>
           <w:tcPr>
-            <w:tcW w:type="dxa" w:w="1701"/>
+            <w:tcW w:type="dxa" w:w="1361"/>
           </w:tcPr>
           <w:p>
             <w:pPr>
@@ -492,7 +493,7 @@
                 <w:i w:val="0"/>
                 <w:sz w:val="22"/>
               </w:rPr>
-              <w:t>3:40</w:t>
+              <w:t>2:25</w:t>
             </w:r>
           </w:p>
         </w:tc>
@@ -500,7 +501,7 @@
       <w:tr>
         <w:tc>
           <w:tcPr>
-            <w:tcW w:type="dxa" w:w="2381"/>
+            <w:tcW w:type="dxa" w:w="737"/>
           </w:tcPr>
           <w:p>
             <w:pPr>
@@ -515,13 +516,13 @@
                 <w:i w:val="0"/>
                 <w:sz w:val="22"/>
               </w:rPr>
-              <w:t>Kết luận</w:t>
+              <w:t>5</w:t>
             </w:r>
           </w:p>
         </w:tc>
         <w:tc>
           <w:tcPr>
-            <w:tcW w:type="dxa" w:w="3628"/>
+            <w:tcW w:type="dxa" w:w="5953"/>
           </w:tcPr>
           <w:p>
             <w:pPr>
@@ -536,13 +537,13 @@
                 <w:i w:val="0"/>
                 <w:sz w:val="22"/>
               </w:rPr>
-              <w:t>Slide 14, rồi slide 15</w:t>
+              <w:t>RQ2: LLM thử 3 lần đạt 65,1%; luật chỉ tốt với lỗi đơn giản</w:t>
             </w:r>
           </w:p>
         </w:tc>
         <w:tc>
           <w:tcPr>
-            <w:tcW w:type="dxa" w:w="1701"/>
+            <w:tcW w:type="dxa" w:w="1361"/>
           </w:tcPr>
           <w:p>
             <w:pPr>
@@ -563,7 +564,351 @@
         </w:tc>
         <w:tc>
           <w:tcPr>
-            <w:tcW w:type="dxa" w:w="1701"/>
+            <w:tcW w:type="dxa" w:w="1361"/>
+          </w:tcPr>
+          <w:p>
+            <w:pPr>
+              <w:spacing w:line="264" w:lineRule="auto"/>
+              <w:jc w:val="left"/>
+            </w:pPr>
+            <w:r/>
+            <w:r>
+              <w:rPr>
+                <w:rFonts w:ascii="Times New Roman" w:hAnsi="Times New Roman" w:eastAsia="Times New Roman"/>
+                <w:b w:val="0"/>
+                <w:i w:val="0"/>
+                <w:sz w:val="22"/>
+              </w:rPr>
+              <w:t>2:50</w:t>
+            </w:r>
+          </w:p>
+        </w:tc>
+      </w:tr>
+      <w:tr>
+        <w:tc>
+          <w:tcPr>
+            <w:tcW w:type="dxa" w:w="737"/>
+          </w:tcPr>
+          <w:p>
+            <w:pPr>
+              <w:spacing w:line="264" w:lineRule="auto"/>
+              <w:jc w:val="left"/>
+            </w:pPr>
+            <w:r/>
+            <w:r>
+              <w:rPr>
+                <w:rFonts w:ascii="Times New Roman" w:hAnsi="Times New Roman" w:eastAsia="Times New Roman"/>
+                <w:b w:val="0"/>
+                <w:i w:val="0"/>
+                <w:sz w:val="22"/>
+              </w:rPr>
+              <w:t>6</w:t>
+            </w:r>
+          </w:p>
+        </w:tc>
+        <w:tc>
+          <w:tcPr>
+            <w:tcW w:type="dxa" w:w="5953"/>
+          </w:tcPr>
+          <w:p>
+            <w:pPr>
+              <w:spacing w:line="264" w:lineRule="auto"/>
+              <w:jc w:val="left"/>
+            </w:pPr>
+            <w:r/>
+            <w:r>
+              <w:rPr>
+                <w:rFonts w:ascii="Times New Roman" w:hAnsi="Times New Roman" w:eastAsia="Times New Roman"/>
+                <w:b w:val="0"/>
+                <w:i w:val="0"/>
+                <w:sz w:val="22"/>
+              </w:rPr>
+              <w:t>RQ3: REPL nhanh 3–4 bậc; 4 worker chỉ nhanh 1,88× vì nghẽn CPU</w:t>
+            </w:r>
+          </w:p>
+        </w:tc>
+        <w:tc>
+          <w:tcPr>
+            <w:tcW w:type="dxa" w:w="1361"/>
+          </w:tcPr>
+          <w:p>
+            <w:pPr>
+              <w:spacing w:line="264" w:lineRule="auto"/>
+              <w:jc w:val="left"/>
+            </w:pPr>
+            <w:r/>
+            <w:r>
+              <w:rPr>
+                <w:rFonts w:ascii="Times New Roman" w:hAnsi="Times New Roman" w:eastAsia="Times New Roman"/>
+                <w:b w:val="0"/>
+                <w:i w:val="0"/>
+                <w:sz w:val="22"/>
+              </w:rPr>
+              <w:t>0:30</w:t>
+            </w:r>
+          </w:p>
+        </w:tc>
+        <w:tc>
+          <w:tcPr>
+            <w:tcW w:type="dxa" w:w="1361"/>
+          </w:tcPr>
+          <w:p>
+            <w:pPr>
+              <w:spacing w:line="264" w:lineRule="auto"/>
+              <w:jc w:val="left"/>
+            </w:pPr>
+            <w:r/>
+            <w:r>
+              <w:rPr>
+                <w:rFonts w:ascii="Times New Roman" w:hAnsi="Times New Roman" w:eastAsia="Times New Roman"/>
+                <w:b w:val="0"/>
+                <w:i w:val="0"/>
+                <w:sz w:val="22"/>
+              </w:rPr>
+              <w:t>3:20</w:t>
+            </w:r>
+          </w:p>
+        </w:tc>
+      </w:tr>
+      <w:tr>
+        <w:tc>
+          <w:tcPr>
+            <w:tcW w:type="dxa" w:w="737"/>
+          </w:tcPr>
+          <w:p>
+            <w:pPr>
+              <w:spacing w:line="264" w:lineRule="auto"/>
+              <w:jc w:val="left"/>
+            </w:pPr>
+            <w:r/>
+            <w:r>
+              <w:rPr>
+                <w:rFonts w:ascii="Times New Roman" w:hAnsi="Times New Roman" w:eastAsia="Times New Roman"/>
+                <w:b w:val="0"/>
+                <w:i w:val="0"/>
+                <w:sz w:val="22"/>
+              </w:rPr>
+              <w:t>7</w:t>
+            </w:r>
+          </w:p>
+        </w:tc>
+        <w:tc>
+          <w:tcPr>
+            <w:tcW w:type="dxa" w:w="5953"/>
+          </w:tcPr>
+          <w:p>
+            <w:pPr>
+              <w:spacing w:line="264" w:lineRule="auto"/>
+              <w:jc w:val="left"/>
+            </w:pPr>
+            <w:r/>
+            <w:r>
+              <w:rPr>
+                <w:rFonts w:ascii="Times New Roman" w:hAnsi="Times New Roman" w:eastAsia="Times New Roman"/>
+                <w:b w:val="0"/>
+                <w:i w:val="0"/>
+                <w:sz w:val="22"/>
+              </w:rPr>
+              <w:t>Kiểm toán là bắt buộc: không có nó, tỷ lệ thành công bị thổi phồng</w:t>
+            </w:r>
+          </w:p>
+        </w:tc>
+        <w:tc>
+          <w:tcPr>
+            <w:tcW w:type="dxa" w:w="1361"/>
+          </w:tcPr>
+          <w:p>
+            <w:pPr>
+              <w:spacing w:line="264" w:lineRule="auto"/>
+              <w:jc w:val="left"/>
+            </w:pPr>
+            <w:r/>
+            <w:r>
+              <w:rPr>
+                <w:rFonts w:ascii="Times New Roman" w:hAnsi="Times New Roman" w:eastAsia="Times New Roman"/>
+                <w:b w:val="0"/>
+                <w:i w:val="0"/>
+                <w:sz w:val="22"/>
+              </w:rPr>
+              <w:t>0:15</w:t>
+            </w:r>
+          </w:p>
+        </w:tc>
+        <w:tc>
+          <w:tcPr>
+            <w:tcW w:type="dxa" w:w="1361"/>
+          </w:tcPr>
+          <w:p>
+            <w:pPr>
+              <w:spacing w:line="264" w:lineRule="auto"/>
+              <w:jc w:val="left"/>
+            </w:pPr>
+            <w:r/>
+            <w:r>
+              <w:rPr>
+                <w:rFonts w:ascii="Times New Roman" w:hAnsi="Times New Roman" w:eastAsia="Times New Roman"/>
+                <w:b w:val="0"/>
+                <w:i w:val="0"/>
+                <w:sz w:val="22"/>
+              </w:rPr>
+              <w:t>3:35</w:t>
+            </w:r>
+          </w:p>
+        </w:tc>
+      </w:tr>
+      <w:tr>
+        <w:tc>
+          <w:tcPr>
+            <w:tcW w:type="dxa" w:w="737"/>
+          </w:tcPr>
+          <w:p>
+            <w:pPr>
+              <w:spacing w:line="264" w:lineRule="auto"/>
+              <w:jc w:val="left"/>
+            </w:pPr>
+            <w:r/>
+            <w:r>
+              <w:rPr>
+                <w:rFonts w:ascii="Times New Roman" w:hAnsi="Times New Roman" w:eastAsia="Times New Roman"/>
+                <w:b w:val="0"/>
+                <w:i w:val="0"/>
+                <w:sz w:val="22"/>
+              </w:rPr>
+              <w:t>8</w:t>
+            </w:r>
+          </w:p>
+        </w:tc>
+        <w:tc>
+          <w:tcPr>
+            <w:tcW w:type="dxa" w:w="5953"/>
+          </w:tcPr>
+          <w:p>
+            <w:pPr>
+              <w:spacing w:line="264" w:lineRule="auto"/>
+              <w:jc w:val="left"/>
+            </w:pPr>
+            <w:r/>
+            <w:r>
+              <w:rPr>
+                <w:rFonts w:ascii="Times New Roman" w:hAnsi="Times New Roman" w:eastAsia="Times New Roman"/>
+                <w:b w:val="0"/>
+                <w:i w:val="0"/>
+                <w:sz w:val="22"/>
+              </w:rPr>
+              <w:t>Kết luận: chẩn đoán, kiểm toán, REPL thường trú; sẵn sàng nhận dữ liệu Nhóm 5</w:t>
+            </w:r>
+          </w:p>
+        </w:tc>
+        <w:tc>
+          <w:tcPr>
+            <w:tcW w:type="dxa" w:w="1361"/>
+          </w:tcPr>
+          <w:p>
+            <w:pPr>
+              <w:spacing w:line="264" w:lineRule="auto"/>
+              <w:jc w:val="left"/>
+            </w:pPr>
+            <w:r/>
+            <w:r>
+              <w:rPr>
+                <w:rFonts w:ascii="Times New Roman" w:hAnsi="Times New Roman" w:eastAsia="Times New Roman"/>
+                <w:b w:val="0"/>
+                <w:i w:val="0"/>
+                <w:sz w:val="22"/>
+              </w:rPr>
+              <w:t>0:20</w:t>
+            </w:r>
+          </w:p>
+        </w:tc>
+        <w:tc>
+          <w:tcPr>
+            <w:tcW w:type="dxa" w:w="1361"/>
+          </w:tcPr>
+          <w:p>
+            <w:pPr>
+              <w:spacing w:line="264" w:lineRule="auto"/>
+              <w:jc w:val="left"/>
+            </w:pPr>
+            <w:r/>
+            <w:r>
+              <w:rPr>
+                <w:rFonts w:ascii="Times New Roman" w:hAnsi="Times New Roman" w:eastAsia="Times New Roman"/>
+                <w:b w:val="0"/>
+                <w:i w:val="0"/>
+                <w:sz w:val="22"/>
+              </w:rPr>
+              <w:t>3:55</w:t>
+            </w:r>
+          </w:p>
+        </w:tc>
+      </w:tr>
+      <w:tr>
+        <w:tc>
+          <w:tcPr>
+            <w:tcW w:type="dxa" w:w="737"/>
+          </w:tcPr>
+          <w:p>
+            <w:pPr>
+              <w:spacing w:line="264" w:lineRule="auto"/>
+              <w:jc w:val="left"/>
+            </w:pPr>
+            <w:r/>
+            <w:r>
+              <w:rPr>
+                <w:rFonts w:ascii="Times New Roman" w:hAnsi="Times New Roman" w:eastAsia="Times New Roman"/>
+                <w:b w:val="0"/>
+                <w:i w:val="0"/>
+                <w:sz w:val="22"/>
+              </w:rPr>
+              <w:t>9</w:t>
+            </w:r>
+          </w:p>
+        </w:tc>
+        <w:tc>
+          <w:tcPr>
+            <w:tcW w:type="dxa" w:w="5953"/>
+          </w:tcPr>
+          <w:p>
+            <w:pPr>
+              <w:spacing w:line="264" w:lineRule="auto"/>
+              <w:jc w:val="left"/>
+            </w:pPr>
+            <w:r/>
+            <w:r>
+              <w:rPr>
+                <w:rFonts w:ascii="Times New Roman" w:hAnsi="Times New Roman" w:eastAsia="Times New Roman"/>
+                <w:b w:val="0"/>
+                <w:i w:val="0"/>
+                <w:sz w:val="22"/>
+              </w:rPr>
+              <w:t>Cảm ơn cô và các bạn · Hỏi đáp</w:t>
+            </w:r>
+          </w:p>
+        </w:tc>
+        <w:tc>
+          <w:tcPr>
+            <w:tcW w:type="dxa" w:w="1361"/>
+          </w:tcPr>
+          <w:p>
+            <w:pPr>
+              <w:spacing w:line="264" w:lineRule="auto"/>
+              <w:jc w:val="left"/>
+            </w:pPr>
+            <w:r/>
+            <w:r>
+              <w:rPr>
+                <w:rFonts w:ascii="Times New Roman" w:hAnsi="Times New Roman" w:eastAsia="Times New Roman"/>
+                <w:b w:val="0"/>
+                <w:i w:val="0"/>
+                <w:sz w:val="22"/>
+              </w:rPr>
+              <w:t>0:10</w:t>
+            </w:r>
+          </w:p>
+        </w:tc>
+        <w:tc>
+          <w:tcPr>
+            <w:tcW w:type="dxa" w:w="1361"/>
           </w:tcPr>
           <w:p>
             <w:pPr>
@@ -587,6 +932,21 @@
     <w:p/>
     <w:p>
       <w:pPr>
+        <w:pStyle w:val="Heading1"/>
+      </w:pPr>
+      <w:r>
+        <w:rPr>
+          <w:rFonts w:ascii="Times New Roman" w:hAnsi="Times New Roman" w:eastAsia="Times New Roman"/>
+          <w:b/>
+          <w:i w:val="0"/>
+          <w:color w:val="144FB0"/>
+          <w:sz w:val="34"/>
+        </w:rPr>
+        <w:t>Lời trình bày</w:t>
+      </w:r>
+    </w:p>
+    <w:p>
+      <w:pPr>
         <w:pStyle w:val="Heading2"/>
       </w:pPr>
       <w:r>
@@ -597,22 +957,7 @@
           <w:color w:val="144FB0"/>
           <w:sz w:val="28"/>
         </w:rPr>
-        <w:t>Mở đầu · 0:15 · mốc 0:15</w:t>
-      </w:r>
-    </w:p>
-    <w:p>
-      <w:pPr>
-        <w:jc w:val="both"/>
-      </w:pPr>
-      <w:r>
-        <w:rPr>
-          <w:rFonts w:ascii="Times New Roman" w:hAnsi="Times New Roman" w:eastAsia="Times New Roman"/>
-          <w:b w:val="0"/>
-          <w:i w:val="0"/>
-          <w:color w:val="808080"/>
-          <w:sz w:val="20"/>
-        </w:rPr>
-        <w:t>[Slide 1]</w:t>
+        <w:t>Slide 1. Mở đầu · 0:15 · mốc 0:15</w:t>
       </w:r>
     </w:p>
     <w:p>
@@ -641,22 +986,7 @@
           <w:color w:val="144FB0"/>
           <w:sz w:val="28"/>
         </w:rPr>
-        <w:t>Đề tài là gì · 0:45 · mốc 1:00</w:t>
-      </w:r>
-    </w:p>
-    <w:p>
-      <w:pPr>
-        <w:jc w:val="both"/>
-      </w:pPr>
-      <w:r>
-        <w:rPr>
-          <w:rFonts w:ascii="Times New Roman" w:hAnsi="Times New Roman" w:eastAsia="Times New Roman"/>
-          <w:b w:val="0"/>
-          <w:i w:val="0"/>
-          <w:color w:val="808080"/>
-          <w:sz w:val="20"/>
-        </w:rPr>
-        <w:t>[Slide 2, rồi slide 4]</w:t>
+        <w:t>Slide 2. Đề tài là gì · 0:45 · mốc 1:00</w:t>
       </w:r>
     </w:p>
     <w:p>
@@ -685,22 +1015,7 @@
           <w:color w:val="144FB0"/>
           <w:sz w:val="28"/>
         </w:rPr>
-        <w:t>Nhóm đã làm gì · 1:05 · mốc 2:05</w:t>
-      </w:r>
-    </w:p>
-    <w:p>
-      <w:pPr>
-        <w:jc w:val="both"/>
-      </w:pPr>
-      <w:r>
-        <w:rPr>
-          <w:rFonts w:ascii="Times New Roman" w:hAnsi="Times New Roman" w:eastAsia="Times New Roman"/>
-          <w:b w:val="0"/>
-          <w:i w:val="0"/>
-          <w:color w:val="808080"/>
-          <w:sz w:val="20"/>
-        </w:rPr>
-        <w:t>[Slide 3, 5, 6, rồi slide 8]</w:t>
+        <w:t>Slide 3. Nhóm đã làm gì · 1:05 · mốc 2:05</w:t>
       </w:r>
     </w:p>
     <w:p>
@@ -729,22 +1044,7 @@
           <w:color w:val="144FB0"/>
           <w:sz w:val="28"/>
         </w:rPr>
-        <w:t>Kết quả · 1:35 · mốc 3:40</w:t>
-      </w:r>
-    </w:p>
-    <w:p>
-      <w:pPr>
-        <w:jc w:val="both"/>
-      </w:pPr>
-      <w:r>
-        <w:rPr>
-          <w:rFonts w:ascii="Times New Roman" w:hAnsi="Times New Roman" w:eastAsia="Times New Roman"/>
-          <w:b w:val="0"/>
-          <w:i w:val="0"/>
-          <w:color w:val="808080"/>
-          <w:sz w:val="20"/>
-        </w:rPr>
-        <w:t>[Slide 9, 10, 11, 13]</w:t>
+        <w:t>Slide 4. Kết quả RQ1 · 0:20 · mốc 2:25</w:t>
       </w:r>
     </w:p>
     <w:p>
@@ -763,6 +1063,21 @@
     </w:p>
     <w:p>
       <w:pPr>
+        <w:pStyle w:val="Heading2"/>
+      </w:pPr>
+      <w:r>
+        <w:rPr>
+          <w:rFonts w:ascii="Times New Roman" w:hAnsi="Times New Roman" w:eastAsia="Times New Roman"/>
+          <w:b/>
+          <w:i w:val="0"/>
+          <w:color w:val="144FB0"/>
+          <w:sz w:val="28"/>
+        </w:rPr>
+        <w:t>Slide 5. Kết quả RQ2 · 0:25 · mốc 2:50</w:t>
+      </w:r>
+    </w:p>
+    <w:p>
+      <w:pPr>
         <w:jc w:val="both"/>
       </w:pPr>
       <w:r>
@@ -777,6 +1092,21 @@
     </w:p>
     <w:p>
       <w:pPr>
+        <w:pStyle w:val="Heading2"/>
+      </w:pPr>
+      <w:r>
+        <w:rPr>
+          <w:rFonts w:ascii="Times New Roman" w:hAnsi="Times New Roman" w:eastAsia="Times New Roman"/>
+          <w:b/>
+          <w:i w:val="0"/>
+          <w:color w:val="144FB0"/>
+          <w:sz w:val="28"/>
+        </w:rPr>
+        <w:t>Slide 6. Kết quả RQ3 · 0:30 · mốc 3:20</w:t>
+      </w:r>
+    </w:p>
+    <w:p>
+      <w:pPr>
         <w:jc w:val="both"/>
       </w:pPr>
       <w:r>
@@ -787,6 +1117,21 @@
           <w:sz w:val="26"/>
         </w:rPr>
         <w:t>Câu hỏi thứ ba: hệ thống mở rộng ra sao. Giữ Lean chạy liên tục làm thời gian kiểm tra một chứng minh giảm từ 63 đến 107 giây xuống khoảng 3 mili giây. Với 10.000 mẫu, 2 tiến trình nhanh gấp 1,76 lần, nhưng 4 tiến trình chỉ nhanh 1,88 lần, vì máy chỉ có 4 nhân CPU.</w:t>
+      </w:r>
+    </w:p>
+    <w:p>
+      <w:pPr>
+        <w:pStyle w:val="Heading2"/>
+      </w:pPr>
+      <w:r>
+        <w:rPr>
+          <w:rFonts w:ascii="Times New Roman" w:hAnsi="Times New Roman" w:eastAsia="Times New Roman"/>
+          <w:b/>
+          <w:i w:val="0"/>
+          <w:color w:val="144FB0"/>
+          <w:sz w:val="28"/>
+        </w:rPr>
+        <w:t>Slide 7. Kiểm toán · 0:15 · mốc 3:35</w:t>
       </w:r>
     </w:p>
     <w:p>
@@ -815,22 +1160,7 @@
           <w:color w:val="144FB0"/>
           <w:sz w:val="28"/>
         </w:rPr>
-        <w:t>Kết luận · 0:25 · mốc 4:05</w:t>
-      </w:r>
-    </w:p>
-    <w:p>
-      <w:pPr>
-        <w:jc w:val="both"/>
-      </w:pPr>
-      <w:r>
-        <w:rPr>
-          <w:rFonts w:ascii="Times New Roman" w:hAnsi="Times New Roman" w:eastAsia="Times New Roman"/>
-          <w:b w:val="0"/>
-          <w:i w:val="0"/>
-          <w:color w:val="808080"/>
-          <w:sz w:val="20"/>
-        </w:rPr>
-        <w:t>[Slide 14, rồi slide 15]</w:t>
+        <w:t>Slide 8. Kết luận · 0:20 · mốc 3:55</w:t>
       </w:r>
     </w:p>
     <w:p>
@@ -844,9 +1174,899 @@
           <w:i w:val="0"/>
           <w:sz w:val="26"/>
         </w:rPr>
-        <w:t>Tóm lại, gửi thông báo lỗi giúp sửa tốt hơn và rẻ hơn, kiểm toán là bắt buộc, và trình kiểm chứng cần chạy liên tục, được lập lịch. Toàn bộ thực nghiệm tốn 2,97 đô la Mỹ, và hệ thống đã sẵn sàng nhận dữ liệu thật từ Nhóm 5. Em xin cảm ơn cô và các bạn.</w:t>
+        <w:t>Tóm lại, gửi thông báo lỗi giúp sửa tốt hơn và rẻ hơn, kiểm toán là bắt buộc, và trình kiểm chứng cần chạy liên tục, được lập lịch. Toàn bộ thực nghiệm tốn 2,97 đô la Mỹ, và hệ thống đã sẵn sàng nhận dữ liệu thật từ Nhóm 5.</w:t>
       </w:r>
     </w:p>
+    <w:p>
+      <w:pPr>
+        <w:pStyle w:val="Heading2"/>
+      </w:pPr>
+      <w:r>
+        <w:rPr>
+          <w:rFonts w:ascii="Times New Roman" w:hAnsi="Times New Roman" w:eastAsia="Times New Roman"/>
+          <w:b/>
+          <w:i w:val="0"/>
+          <w:color w:val="144FB0"/>
+          <w:sz w:val="28"/>
+        </w:rPr>
+        <w:t>Slide 9. Hỏi đáp · 0:10 · mốc 4:05</w:t>
+      </w:r>
+    </w:p>
+    <w:p>
+      <w:pPr>
+        <w:jc w:val="both"/>
+      </w:pPr>
+      <w:r>
+        <w:rPr>
+          <w:rFonts w:ascii="Times New Roman" w:hAnsi="Times New Roman" w:eastAsia="Times New Roman"/>
+          <w:b w:val="0"/>
+          <w:i w:val="0"/>
+          <w:sz w:val="26"/>
+        </w:rPr>
+        <w:t>Em xin cảm ơn cô và các bạn. Phần còn lại xin dành cho câu hỏi; bảng trên slide là thành viên trả lời từng mảng.</w:t>
+      </w:r>
+    </w:p>
+    <w:p>
+      <w:pPr>
+        <w:pStyle w:val="Heading1"/>
+      </w:pPr>
+      <w:r>
+        <w:rPr>
+          <w:rFonts w:ascii="Times New Roman" w:hAnsi="Times New Roman" w:eastAsia="Times New Roman"/>
+          <w:b/>
+          <w:i w:val="0"/>
+          <w:color w:val="144FB0"/>
+          <w:sz w:val="34"/>
+        </w:rPr>
+        <w:t>Hỏi đáp: ai trả lời, mở slide nào</w:t>
+      </w:r>
+    </w:p>
+    <w:tbl>
+      <w:tblPr>
+        <w:tblStyle w:val="TableGrid"/>
+        <w:tblW w:type="dxa" w:w="9412"/>
+        <w:jc w:val="center"/>
+        <w:tblLayout w:type="fixed"/>
+        <w:tblLook w:firstColumn="1" w:firstRow="1" w:lastColumn="0" w:lastRow="0" w:noHBand="0" w:noVBand="1" w:val="04A0"/>
+      </w:tblPr>
+      <w:tblGrid>
+        <w:gridCol w:w="2608"/>
+        <w:gridCol w:w="4536"/>
+        <w:gridCol w:w="2268"/>
+      </w:tblGrid>
+      <w:tr>
+        <w:tc>
+          <w:tcPr>
+            <w:tcW w:type="dxa" w:w="2608"/>
+            <w:shd w:val="clear" w:color="auto" w:fill="1E6FE8"/>
+          </w:tcPr>
+          <w:p>
+            <w:pPr>
+              <w:spacing w:line="264" w:lineRule="auto"/>
+              <w:jc w:val="left"/>
+            </w:pPr>
+            <w:r/>
+            <w:r>
+              <w:rPr>
+                <w:rFonts w:ascii="Times New Roman" w:hAnsi="Times New Roman" w:eastAsia="Times New Roman"/>
+                <w:b/>
+                <w:i w:val="0"/>
+                <w:color w:val="FFFFFF"/>
+                <w:sz w:val="22"/>
+              </w:rPr>
+              <w:t>Thành viên</w:t>
+            </w:r>
+          </w:p>
+        </w:tc>
+        <w:tc>
+          <w:tcPr>
+            <w:tcW w:type="dxa" w:w="4535"/>
+            <w:shd w:val="clear" w:color="auto" w:fill="1E6FE8"/>
+          </w:tcPr>
+          <w:p>
+            <w:pPr>
+              <w:spacing w:line="264" w:lineRule="auto"/>
+              <w:jc w:val="left"/>
+            </w:pPr>
+            <w:r/>
+            <w:r>
+              <w:rPr>
+                <w:rFonts w:ascii="Times New Roman" w:hAnsi="Times New Roman" w:eastAsia="Times New Roman"/>
+                <w:b/>
+                <w:i w:val="0"/>
+                <w:color w:val="FFFFFF"/>
+                <w:sz w:val="22"/>
+              </w:rPr>
+              <w:t>Mảng trả lời</w:t>
+            </w:r>
+          </w:p>
+        </w:tc>
+        <w:tc>
+          <w:tcPr>
+            <w:tcW w:type="dxa" w:w="2268"/>
+            <w:shd w:val="clear" w:color="auto" w:fill="1E6FE8"/>
+          </w:tcPr>
+          <w:p>
+            <w:pPr>
+              <w:spacing w:line="264" w:lineRule="auto"/>
+              <w:jc w:val="left"/>
+            </w:pPr>
+            <w:r/>
+            <w:r>
+              <w:rPr>
+                <w:rFonts w:ascii="Times New Roman" w:hAnsi="Times New Roman" w:eastAsia="Times New Roman"/>
+                <w:b/>
+                <w:i w:val="0"/>
+                <w:color w:val="FFFFFF"/>
+                <w:sz w:val="22"/>
+              </w:rPr>
+              <w:t>Slide dự phòng</w:t>
+            </w:r>
+          </w:p>
+        </w:tc>
+      </w:tr>
+      <w:tr>
+        <w:tc>
+          <w:tcPr>
+            <w:tcW w:type="dxa" w:w="2608"/>
+          </w:tcPr>
+          <w:p>
+            <w:pPr>
+              <w:spacing w:line="264" w:lineRule="auto"/>
+              <w:jc w:val="left"/>
+            </w:pPr>
+            <w:r/>
+            <w:r>
+              <w:rPr>
+                <w:rFonts w:ascii="Times New Roman" w:hAnsi="Times New Roman" w:eastAsia="Times New Roman"/>
+                <w:b w:val="0"/>
+                <w:i w:val="0"/>
+                <w:sz w:val="22"/>
+              </w:rPr>
+              <w:t>Đào Văn Tâm</w:t>
+            </w:r>
+          </w:p>
+        </w:tc>
+        <w:tc>
+          <w:tcPr>
+            <w:tcW w:type="dxa" w:w="4535"/>
+          </w:tcPr>
+          <w:p>
+            <w:pPr>
+              <w:spacing w:line="264" w:lineRule="auto"/>
+              <w:jc w:val="left"/>
+            </w:pPr>
+            <w:r/>
+            <w:r>
+              <w:rPr>
+                <w:rFonts w:ascii="Times New Roman" w:hAnsi="Times New Roman" w:eastAsia="Times New Roman"/>
+                <w:b w:val="0"/>
+                <w:i w:val="0"/>
+                <w:sz w:val="22"/>
+              </w:rPr>
+              <w:t>Câu hỏi nghiên cứu, đánh giá, chi phí</w:t>
+            </w:r>
+          </w:p>
+        </w:tc>
+        <w:tc>
+          <w:tcPr>
+            <w:tcW w:type="dxa" w:w="2268"/>
+          </w:tcPr>
+          <w:p>
+            <w:pPr>
+              <w:spacing w:line="264" w:lineRule="auto"/>
+              <w:jc w:val="left"/>
+            </w:pPr>
+            <w:r/>
+            <w:r>
+              <w:rPr>
+                <w:rFonts w:ascii="Times New Roman" w:hAnsi="Times New Roman" w:eastAsia="Times New Roman"/>
+                <w:b w:val="0"/>
+                <w:i w:val="0"/>
+                <w:sz w:val="22"/>
+              </w:rPr>
+              <w:t>P5, P6</w:t>
+            </w:r>
+          </w:p>
+        </w:tc>
+      </w:tr>
+      <w:tr>
+        <w:tc>
+          <w:tcPr>
+            <w:tcW w:type="dxa" w:w="2608"/>
+          </w:tcPr>
+          <w:p>
+            <w:pPr>
+              <w:spacing w:line="264" w:lineRule="auto"/>
+              <w:jc w:val="left"/>
+            </w:pPr>
+            <w:r/>
+            <w:r>
+              <w:rPr>
+                <w:rFonts w:ascii="Times New Roman" w:hAnsi="Times New Roman" w:eastAsia="Times New Roman"/>
+                <w:b w:val="0"/>
+                <w:i w:val="0"/>
+                <w:sz w:val="22"/>
+              </w:rPr>
+              <w:t>Trần Quang Đức Dũng</w:t>
+            </w:r>
+          </w:p>
+        </w:tc>
+        <w:tc>
+          <w:tcPr>
+            <w:tcW w:type="dxa" w:w="4535"/>
+          </w:tcPr>
+          <w:p>
+            <w:pPr>
+              <w:spacing w:line="264" w:lineRule="auto"/>
+              <w:jc w:val="left"/>
+            </w:pPr>
+            <w:r/>
+            <w:r>
+              <w:rPr>
+                <w:rFonts w:ascii="Times New Roman" w:hAnsi="Times New Roman" w:eastAsia="Times New Roman"/>
+                <w:b w:val="0"/>
+                <w:i w:val="0"/>
+                <w:sz w:val="22"/>
+              </w:rPr>
+              <w:t>Worker, REPL, mở rộng, hàng đợi</w:t>
+            </w:r>
+          </w:p>
+        </w:tc>
+        <w:tc>
+          <w:tcPr>
+            <w:tcW w:type="dxa" w:w="2268"/>
+          </w:tcPr>
+          <w:p>
+            <w:pPr>
+              <w:spacing w:line="264" w:lineRule="auto"/>
+              <w:jc w:val="left"/>
+            </w:pPr>
+            <w:r/>
+            <w:r>
+              <w:rPr>
+                <w:rFonts w:ascii="Times New Roman" w:hAnsi="Times New Roman" w:eastAsia="Times New Roman"/>
+                <w:b w:val="0"/>
+                <w:i w:val="0"/>
+                <w:sz w:val="22"/>
+              </w:rPr>
+              <w:t>P7</w:t>
+            </w:r>
+          </w:p>
+        </w:tc>
+      </w:tr>
+      <w:tr>
+        <w:tc>
+          <w:tcPr>
+            <w:tcW w:type="dxa" w:w="2608"/>
+          </w:tcPr>
+          <w:p>
+            <w:pPr>
+              <w:spacing w:line="264" w:lineRule="auto"/>
+              <w:jc w:val="left"/>
+            </w:pPr>
+            <w:r/>
+            <w:r>
+              <w:rPr>
+                <w:rFonts w:ascii="Times New Roman" w:hAnsi="Times New Roman" w:eastAsia="Times New Roman"/>
+                <w:b w:val="0"/>
+                <w:i w:val="0"/>
+                <w:sz w:val="22"/>
+              </w:rPr>
+              <w:t>Lâm Thành Trung</w:t>
+            </w:r>
+          </w:p>
+        </w:tc>
+        <w:tc>
+          <w:tcPr>
+            <w:tcW w:type="dxa" w:w="4535"/>
+          </w:tcPr>
+          <w:p>
+            <w:pPr>
+              <w:spacing w:line="264" w:lineRule="auto"/>
+              <w:jc w:val="left"/>
+            </w:pPr>
+            <w:r/>
+            <w:r>
+              <w:rPr>
+                <w:rFonts w:ascii="Times New Roman" w:hAnsi="Times New Roman" w:eastAsia="Times New Roman"/>
+                <w:b w:val="0"/>
+                <w:i w:val="0"/>
+                <w:sz w:val="22"/>
+              </w:rPr>
+              <w:t>Luật sửa, độ chính xác từng luật</w:t>
+            </w:r>
+          </w:p>
+        </w:tc>
+        <w:tc>
+          <w:tcPr>
+            <w:tcW w:type="dxa" w:w="2268"/>
+          </w:tcPr>
+          <w:p>
+            <w:pPr>
+              <w:spacing w:line="264" w:lineRule="auto"/>
+              <w:jc w:val="left"/>
+            </w:pPr>
+            <w:r/>
+            <w:r>
+              <w:rPr>
+                <w:rFonts w:ascii="Times New Roman" w:hAnsi="Times New Roman" w:eastAsia="Times New Roman"/>
+                <w:b w:val="0"/>
+                <w:i w:val="0"/>
+                <w:sz w:val="22"/>
+              </w:rPr>
+              <w:t>P4</w:t>
+            </w:r>
+          </w:p>
+        </w:tc>
+      </w:tr>
+      <w:tr>
+        <w:tc>
+          <w:tcPr>
+            <w:tcW w:type="dxa" w:w="2608"/>
+          </w:tcPr>
+          <w:p>
+            <w:pPr>
+              <w:spacing w:line="264" w:lineRule="auto"/>
+              <w:jc w:val="left"/>
+            </w:pPr>
+            <w:r/>
+            <w:r>
+              <w:rPr>
+                <w:rFonts w:ascii="Times New Roman" w:hAnsi="Times New Roman" w:eastAsia="Times New Roman"/>
+                <w:b w:val="0"/>
+                <w:i w:val="0"/>
+                <w:sz w:val="22"/>
+              </w:rPr>
+              <w:t>Nguyễn Xuân Tùng</w:t>
+            </w:r>
+          </w:p>
+        </w:tc>
+        <w:tc>
+          <w:tcPr>
+            <w:tcW w:type="dxa" w:w="4535"/>
+          </w:tcPr>
+          <w:p>
+            <w:pPr>
+              <w:spacing w:line="264" w:lineRule="auto"/>
+              <w:jc w:val="left"/>
+            </w:pPr>
+            <w:r/>
+            <w:r>
+              <w:rPr>
+                <w:rFonts w:ascii="Times New Roman" w:hAnsi="Times New Roman" w:eastAsia="Times New Roman"/>
+                <w:b w:val="0"/>
+                <w:i w:val="0"/>
+                <w:sz w:val="22"/>
+              </w:rPr>
+              <w:t>LLM, prompt, chọn mô hình, demo</w:t>
+            </w:r>
+          </w:p>
+        </w:tc>
+        <w:tc>
+          <w:tcPr>
+            <w:tcW w:type="dxa" w:w="2268"/>
+          </w:tcPr>
+          <w:p>
+            <w:pPr>
+              <w:spacing w:line="264" w:lineRule="auto"/>
+              <w:jc w:val="left"/>
+            </w:pPr>
+            <w:r/>
+            <w:r>
+              <w:rPr>
+                <w:rFonts w:ascii="Times New Roman" w:hAnsi="Times New Roman" w:eastAsia="Times New Roman"/>
+                <w:b w:val="0"/>
+                <w:i w:val="0"/>
+                <w:sz w:val="22"/>
+              </w:rPr>
+              <w:t>P1</w:t>
+            </w:r>
+          </w:p>
+        </w:tc>
+      </w:tr>
+      <w:tr>
+        <w:tc>
+          <w:tcPr>
+            <w:tcW w:type="dxa" w:w="2608"/>
+          </w:tcPr>
+          <w:p>
+            <w:pPr>
+              <w:spacing w:line="264" w:lineRule="auto"/>
+              <w:jc w:val="left"/>
+            </w:pPr>
+            <w:r/>
+            <w:r>
+              <w:rPr>
+                <w:rFonts w:ascii="Times New Roman" w:hAnsi="Times New Roman" w:eastAsia="Times New Roman"/>
+                <w:b w:val="0"/>
+                <w:i w:val="0"/>
+                <w:sz w:val="22"/>
+              </w:rPr>
+              <w:t>Khamsing OUTHAIHUENG</w:t>
+            </w:r>
+          </w:p>
+        </w:tc>
+        <w:tc>
+          <w:tcPr>
+            <w:tcW w:type="dxa" w:w="4535"/>
+          </w:tcPr>
+          <w:p>
+            <w:pPr>
+              <w:spacing w:line="264" w:lineRule="auto"/>
+              <w:jc w:val="left"/>
+            </w:pPr>
+            <w:r/>
+            <w:r>
+              <w:rPr>
+                <w:rFonts w:ascii="Times New Roman" w:hAnsi="Times New Roman" w:eastAsia="Times New Roman"/>
+                <w:b w:val="0"/>
+                <w:i w:val="0"/>
+                <w:sz w:val="22"/>
+              </w:rPr>
+              <w:t>Phân loại lỗi, kiểm toán, kiến trúc</w:t>
+            </w:r>
+          </w:p>
+        </w:tc>
+        <w:tc>
+          <w:tcPr>
+            <w:tcW w:type="dxa" w:w="2268"/>
+          </w:tcPr>
+          <w:p>
+            <w:pPr>
+              <w:spacing w:line="264" w:lineRule="auto"/>
+              <w:jc w:val="left"/>
+            </w:pPr>
+            <w:r/>
+            <w:r>
+              <w:rPr>
+                <w:rFonts w:ascii="Times New Roman" w:hAnsi="Times New Roman" w:eastAsia="Times New Roman"/>
+                <w:b w:val="0"/>
+                <w:i w:val="0"/>
+                <w:sz w:val="22"/>
+              </w:rPr>
+              <w:t>P3</w:t>
+            </w:r>
+          </w:p>
+        </w:tc>
+      </w:tr>
+      <w:tr>
+        <w:tc>
+          <w:tcPr>
+            <w:tcW w:type="dxa" w:w="2608"/>
+          </w:tcPr>
+          <w:p>
+            <w:pPr>
+              <w:spacing w:line="264" w:lineRule="auto"/>
+              <w:jc w:val="left"/>
+            </w:pPr>
+            <w:r/>
+            <w:r>
+              <w:rPr>
+                <w:rFonts w:ascii="Times New Roman" w:hAnsi="Times New Roman" w:eastAsia="Times New Roman"/>
+                <w:b w:val="0"/>
+                <w:i w:val="0"/>
+                <w:sz w:val="22"/>
+              </w:rPr>
+              <w:t>Mekdala Nounou</w:t>
+            </w:r>
+          </w:p>
+        </w:tc>
+        <w:tc>
+          <w:tcPr>
+            <w:tcW w:type="dxa" w:w="4535"/>
+          </w:tcPr>
+          <w:p>
+            <w:pPr>
+              <w:spacing w:line="264" w:lineRule="auto"/>
+              <w:jc w:val="left"/>
+            </w:pPr>
+            <w:r/>
+            <w:r>
+              <w:rPr>
+                <w:rFonts w:ascii="Times New Roman" w:hAnsi="Times New Roman" w:eastAsia="Times New Roman"/>
+                <w:b w:val="0"/>
+                <w:i w:val="0"/>
+                <w:sz w:val="22"/>
+              </w:rPr>
+              <w:t>Dữ liệu, chia tập</w:t>
+            </w:r>
+          </w:p>
+        </w:tc>
+        <w:tc>
+          <w:tcPr>
+            <w:tcW w:type="dxa" w:w="2268"/>
+          </w:tcPr>
+          <w:p>
+            <w:pPr>
+              <w:spacing w:line="264" w:lineRule="auto"/>
+              <w:jc w:val="left"/>
+            </w:pPr>
+            <w:r/>
+            <w:r>
+              <w:rPr>
+                <w:rFonts w:ascii="Times New Roman" w:hAnsi="Times New Roman" w:eastAsia="Times New Roman"/>
+                <w:b w:val="0"/>
+                <w:i w:val="0"/>
+                <w:sz w:val="22"/>
+              </w:rPr>
+              <w:t>P2</w:t>
+            </w:r>
+          </w:p>
+        </w:tc>
+      </w:tr>
+    </w:tbl>
+    <w:p/>
+    <w:tbl>
+      <w:tblPr>
+        <w:tblStyle w:val="TableGrid"/>
+        <w:tblW w:type="dxa" w:w="9412"/>
+        <w:jc w:val="center"/>
+        <w:tblLayout w:type="fixed"/>
+        <w:tblLook w:firstColumn="1" w:firstRow="1" w:lastColumn="0" w:lastRow="0" w:noHBand="0" w:noVBand="1" w:val="04A0"/>
+      </w:tblPr>
+      <w:tblGrid>
+        <w:gridCol w:w="1701"/>
+        <w:gridCol w:w="7711"/>
+      </w:tblGrid>
+      <w:tr>
+        <w:tc>
+          <w:tcPr>
+            <w:tcW w:type="dxa" w:w="1701"/>
+            <w:shd w:val="clear" w:color="auto" w:fill="1E6FE8"/>
+          </w:tcPr>
+          <w:p>
+            <w:pPr>
+              <w:spacing w:line="264" w:lineRule="auto"/>
+              <w:jc w:val="left"/>
+            </w:pPr>
+            <w:r/>
+            <w:r>
+              <w:rPr>
+                <w:rFonts w:ascii="Times New Roman" w:hAnsi="Times New Roman" w:eastAsia="Times New Roman"/>
+                <w:b/>
+                <w:i w:val="0"/>
+                <w:color w:val="FFFFFF"/>
+                <w:sz w:val="22"/>
+              </w:rPr>
+              <w:t>Slide dự phòng</w:t>
+            </w:r>
+          </w:p>
+        </w:tc>
+        <w:tc>
+          <w:tcPr>
+            <w:tcW w:type="dxa" w:w="7710"/>
+            <w:shd w:val="clear" w:color="auto" w:fill="1E6FE8"/>
+          </w:tcPr>
+          <w:p>
+            <w:pPr>
+              <w:spacing w:line="264" w:lineRule="auto"/>
+              <w:jc w:val="left"/>
+            </w:pPr>
+            <w:r/>
+            <w:r>
+              <w:rPr>
+                <w:rFonts w:ascii="Times New Roman" w:hAnsi="Times New Roman" w:eastAsia="Times New Roman"/>
+                <w:b/>
+                <w:i w:val="0"/>
+                <w:color w:val="FFFFFF"/>
+                <w:sz w:val="22"/>
+              </w:rPr>
+              <w:t>Nội dung</w:t>
+            </w:r>
+          </w:p>
+        </w:tc>
+      </w:tr>
+      <w:tr>
+        <w:tc>
+          <w:tcPr>
+            <w:tcW w:type="dxa" w:w="1701"/>
+          </w:tcPr>
+          <w:p>
+            <w:pPr>
+              <w:spacing w:line="264" w:lineRule="auto"/>
+              <w:jc w:val="left"/>
+            </w:pPr>
+            <w:r/>
+            <w:r>
+              <w:rPr>
+                <w:rFonts w:ascii="Times New Roman" w:hAnsi="Times New Roman" w:eastAsia="Times New Roman"/>
+                <w:b w:val="0"/>
+                <w:i w:val="0"/>
+                <w:sz w:val="22"/>
+              </w:rPr>
+              <w:t>P1</w:t>
+            </w:r>
+          </w:p>
+        </w:tc>
+        <w:tc>
+          <w:tcPr>
+            <w:tcW w:type="dxa" w:w="7710"/>
+          </w:tcPr>
+          <w:p>
+            <w:pPr>
+              <w:spacing w:line="264" w:lineRule="auto"/>
+              <w:jc w:val="left"/>
+            </w:pPr>
+            <w:r/>
+            <w:r>
+              <w:rPr>
+                <w:rFonts w:ascii="Times New Roman" w:hAnsi="Times New Roman" w:eastAsia="Times New Roman"/>
+                <w:b w:val="0"/>
+                <w:i w:val="0"/>
+                <w:sz w:val="22"/>
+              </w:rPr>
+              <w:t>Demo: lỗi → phân loại → sửa → Lean kiểm tra → kiểm toán</w:t>
+            </w:r>
+          </w:p>
+        </w:tc>
+      </w:tr>
+      <w:tr>
+        <w:tc>
+          <w:tcPr>
+            <w:tcW w:type="dxa" w:w="1701"/>
+          </w:tcPr>
+          <w:p>
+            <w:pPr>
+              <w:spacing w:line="264" w:lineRule="auto"/>
+              <w:jc w:val="left"/>
+            </w:pPr>
+            <w:r/>
+            <w:r>
+              <w:rPr>
+                <w:rFonts w:ascii="Times New Roman" w:hAnsi="Times New Roman" w:eastAsia="Times New Roman"/>
+                <w:b w:val="0"/>
+                <w:i w:val="0"/>
+                <w:sz w:val="22"/>
+              </w:rPr>
+              <w:t>P2</w:t>
+            </w:r>
+          </w:p>
+        </w:tc>
+        <w:tc>
+          <w:tcPr>
+            <w:tcW w:type="dxa" w:w="7710"/>
+          </w:tcPr>
+          <w:p>
+            <w:pPr>
+              <w:spacing w:line="264" w:lineRule="auto"/>
+              <w:jc w:val="left"/>
+            </w:pPr>
+            <w:r/>
+            <w:r>
+              <w:rPr>
+                <w:rFonts w:ascii="Times New Roman" w:hAnsi="Times New Roman" w:eastAsia="Times New Roman"/>
+                <w:b w:val="0"/>
+                <w:i w:val="0"/>
+                <w:sz w:val="22"/>
+              </w:rPr>
+              <w:t>Dataset 17.031 lỗi có nhãn lấy từ chính Lean</w:t>
+            </w:r>
+          </w:p>
+        </w:tc>
+      </w:tr>
+      <w:tr>
+        <w:tc>
+          <w:tcPr>
+            <w:tcW w:type="dxa" w:w="1701"/>
+          </w:tcPr>
+          <w:p>
+            <w:pPr>
+              <w:spacing w:line="264" w:lineRule="auto"/>
+              <w:jc w:val="left"/>
+            </w:pPr>
+            <w:r/>
+            <w:r>
+              <w:rPr>
+                <w:rFonts w:ascii="Times New Roman" w:hAnsi="Times New Roman" w:eastAsia="Times New Roman"/>
+                <w:b w:val="0"/>
+                <w:i w:val="0"/>
+                <w:sz w:val="22"/>
+              </w:rPr>
+              <w:t>P3</w:t>
+            </w:r>
+          </w:p>
+        </w:tc>
+        <w:tc>
+          <w:tcPr>
+            <w:tcW w:type="dxa" w:w="7710"/>
+          </w:tcPr>
+          <w:p>
+            <w:pPr>
+              <w:spacing w:line="264" w:lineRule="auto"/>
+              <w:jc w:val="left"/>
+            </w:pPr>
+            <w:r/>
+            <w:r>
+              <w:rPr>
+                <w:rFonts w:ascii="Times New Roman" w:hAnsi="Times New Roman" w:eastAsia="Times New Roman"/>
+                <w:b w:val="0"/>
+                <w:i w:val="0"/>
+                <w:sz w:val="22"/>
+              </w:rPr>
+              <w:t>Kiến trúc: mỗi bản sửa qua Lean và kiểm toán</w:t>
+            </w:r>
+          </w:p>
+        </w:tc>
+      </w:tr>
+      <w:tr>
+        <w:tc>
+          <w:tcPr>
+            <w:tcW w:type="dxa" w:w="1701"/>
+          </w:tcPr>
+          <w:p>
+            <w:pPr>
+              <w:spacing w:line="264" w:lineRule="auto"/>
+              <w:jc w:val="left"/>
+            </w:pPr>
+            <w:r/>
+            <w:r>
+              <w:rPr>
+                <w:rFonts w:ascii="Times New Roman" w:hAnsi="Times New Roman" w:eastAsia="Times New Roman"/>
+                <w:b w:val="0"/>
+                <w:i w:val="0"/>
+                <w:sz w:val="22"/>
+              </w:rPr>
+              <w:t>P4</w:t>
+            </w:r>
+          </w:p>
+        </w:tc>
+        <w:tc>
+          <w:tcPr>
+            <w:tcW w:type="dxa" w:w="7710"/>
+          </w:tcPr>
+          <w:p>
+            <w:pPr>
+              <w:spacing w:line="264" w:lineRule="auto"/>
+              <w:jc w:val="left"/>
+            </w:pPr>
+            <w:r/>
+            <w:r>
+              <w:rPr>
+                <w:rFonts w:ascii="Times New Roman" w:hAnsi="Times New Roman" w:eastAsia="Times New Roman"/>
+                <w:b w:val="0"/>
+                <w:i w:val="0"/>
+                <w:sz w:val="22"/>
+              </w:rPr>
+              <w:t>Luật đúng gần hoàn hảo, luật sai kéo chiến lược lai xuống</w:t>
+            </w:r>
+          </w:p>
+        </w:tc>
+      </w:tr>
+      <w:tr>
+        <w:tc>
+          <w:tcPr>
+            <w:tcW w:type="dxa" w:w="1701"/>
+          </w:tcPr>
+          <w:p>
+            <w:pPr>
+              <w:spacing w:line="264" w:lineRule="auto"/>
+              <w:jc w:val="left"/>
+            </w:pPr>
+            <w:r/>
+            <w:r>
+              <w:rPr>
+                <w:rFonts w:ascii="Times New Roman" w:hAnsi="Times New Roman" w:eastAsia="Times New Roman"/>
+                <w:b w:val="0"/>
+                <w:i w:val="0"/>
+                <w:sz w:val="22"/>
+              </w:rPr>
+              <w:t>P5</w:t>
+            </w:r>
+          </w:p>
+        </w:tc>
+        <w:tc>
+          <w:tcPr>
+            <w:tcW w:type="dxa" w:w="7710"/>
+          </w:tcPr>
+          <w:p>
+            <w:pPr>
+              <w:spacing w:line="264" w:lineRule="auto"/>
+              <w:jc w:val="left"/>
+            </w:pPr>
+            <w:r/>
+            <w:r>
+              <w:rPr>
+                <w:rFonts w:ascii="Times New Roman" w:hAnsi="Times New Roman" w:eastAsia="Times New Roman"/>
+                <w:b w:val="0"/>
+                <w:i w:val="0"/>
+                <w:sz w:val="22"/>
+              </w:rPr>
+              <w:t>Thiết lập: cùng dữ liệu, phần cứng và seed, chỉ đổi chiến lược</w:t>
+            </w:r>
+          </w:p>
+        </w:tc>
+      </w:tr>
+      <w:tr>
+        <w:tc>
+          <w:tcPr>
+            <w:tcW w:type="dxa" w:w="1701"/>
+          </w:tcPr>
+          <w:p>
+            <w:pPr>
+              <w:spacing w:line="264" w:lineRule="auto"/>
+              <w:jc w:val="left"/>
+            </w:pPr>
+            <w:r/>
+            <w:r>
+              <w:rPr>
+                <w:rFonts w:ascii="Times New Roman" w:hAnsi="Times New Roman" w:eastAsia="Times New Roman"/>
+                <w:b w:val="0"/>
+                <w:i w:val="0"/>
+                <w:sz w:val="22"/>
+              </w:rPr>
+              <w:t>P6</w:t>
+            </w:r>
+          </w:p>
+        </w:tc>
+        <w:tc>
+          <w:tcPr>
+            <w:tcW w:type="dxa" w:w="7710"/>
+          </w:tcPr>
+          <w:p>
+            <w:pPr>
+              <w:spacing w:line="264" w:lineRule="auto"/>
+              <w:jc w:val="left"/>
+            </w:pPr>
+            <w:r/>
+            <w:r>
+              <w:rPr>
+                <w:rFonts w:ascii="Times New Roman" w:hAnsi="Times New Roman" w:eastAsia="Times New Roman"/>
+                <w:b w:val="0"/>
+                <w:i w:val="0"/>
+                <w:sz w:val="22"/>
+              </w:rPr>
+              <w:t>Ablation: biên dịch và thành công đã kiểm toán</w:t>
+            </w:r>
+          </w:p>
+        </w:tc>
+      </w:tr>
+      <w:tr>
+        <w:tc>
+          <w:tcPr>
+            <w:tcW w:type="dxa" w:w="1701"/>
+          </w:tcPr>
+          <w:p>
+            <w:pPr>
+              <w:spacing w:line="264" w:lineRule="auto"/>
+              <w:jc w:val="left"/>
+            </w:pPr>
+            <w:r/>
+            <w:r>
+              <w:rPr>
+                <w:rFonts w:ascii="Times New Roman" w:hAnsi="Times New Roman" w:eastAsia="Times New Roman"/>
+                <w:b w:val="0"/>
+                <w:i w:val="0"/>
+                <w:sz w:val="22"/>
+              </w:rPr>
+              <w:t>P7</w:t>
+            </w:r>
+          </w:p>
+        </w:tc>
+        <w:tc>
+          <w:tcPr>
+            <w:tcW w:type="dxa" w:w="7710"/>
+          </w:tcPr>
+          <w:p>
+            <w:pPr>
+              <w:spacing w:line="264" w:lineRule="auto"/>
+              <w:jc w:val="left"/>
+            </w:pPr>
+            <w:r/>
+            <w:r>
+              <w:rPr>
+                <w:rFonts w:ascii="Times New Roman" w:hAnsi="Times New Roman" w:eastAsia="Times New Roman"/>
+                <w:b w:val="0"/>
+                <w:i w:val="0"/>
+                <w:sz w:val="22"/>
+              </w:rPr>
+              <w:t>Độ trễ phục vụ P50 và P95 ở 3 mức dữ liệu</w:t>
+            </w:r>
+          </w:p>
+        </w:tc>
+      </w:tr>
+    </w:tbl>
+    <w:p/>
     <w:sectPr>
       <w:footerReference w:type="default" r:id="rId9"/>
       <w:pgSz w:w="11906" w:h="16838"/>

</xml_diff>